<commit_message>
Add a budget look planner, Shop this room and Compare
- Budget look planner ("Plan" tab): a Groq model plans 3-5 wearable
  pieces for the occasion and splits the budget; each piece is searched
  and checked by the listing judge within its share; one listing is
  picked per piece so the total fits the budget, and any piece can be
  swapped with the total updating.
- Shop this room: the vision model lists the furniture and decor in a
  room photo with boxes; each piece is searched and re-ranked against
  its crop, with the price of the whole room.
- Compare: a checkbox on every card; 2-3 picks open a side-by-side
  table with features read from the names, strong points, a best pick
  and a verdict.

Co-Authored-By: Claude Opus 5.5 <noreply@anthropic.com>
</commit_message>
<xml_diff>
--- a/docs/SnapBuy AI - Project Guide.docx
+++ b/docs/SnapBuy AI - Project Guide.docx
@@ -380,6 +380,78 @@
             </w:pPr>
             <w:r>
               <w:t xml:space="preserve">On any product: AI suggests what goes with it, with listings</w:t>
+            </w:r>
+          </w:p>
+        </w:tc>
+      </w:tr>
+      <w:tr>
+        <w:tc>
+          <w:tcPr/>
+          <w:p>
+            <w:pPr>
+              <w:pStyle w:val="Compact"/>
+            </w:pPr>
+            <w:r>
+              <w:t xml:space="preserve">Plan on a budget</w:t>
+            </w:r>
+          </w:p>
+        </w:tc>
+        <w:tc>
+          <w:tcPr/>
+          <w:p>
+            <w:pPr>
+              <w:pStyle w:val="Compact"/>
+            </w:pPr>
+            <w:r>
+              <w:t xml:space="preserve">"Wedding guest outfit, men, ₹5,000" → a whole look, one pick per piece, total within budget</w:t>
+            </w:r>
+          </w:p>
+        </w:tc>
+      </w:tr>
+      <w:tr>
+        <w:tc>
+          <w:tcPr/>
+          <w:p>
+            <w:pPr>
+              <w:pStyle w:val="Compact"/>
+            </w:pPr>
+            <w:r>
+              <w:t xml:space="preserve">Shop this room</w:t>
+            </w:r>
+          </w:p>
+        </w:tc>
+        <w:tc>
+          <w:tcPr/>
+          <w:p>
+            <w:pPr>
+              <w:pStyle w:val="Compact"/>
+            </w:pPr>
+            <w:r>
+              <w:t xml:space="preserve">One room photo → every piece of furniture and decor, each with listings</w:t>
+            </w:r>
+          </w:p>
+        </w:tc>
+      </w:tr>
+      <w:tr>
+        <w:tc>
+          <w:tcPr/>
+          <w:p>
+            <w:pPr>
+              <w:pStyle w:val="Compact"/>
+            </w:pPr>
+            <w:r>
+              <w:t xml:space="preserve">Compare</w:t>
+            </w:r>
+          </w:p>
+        </w:tc>
+        <w:tc>
+          <w:tcPr/>
+          <w:p>
+            <w:pPr>
+              <w:pStyle w:val="Compact"/>
+            </w:pPr>
+            <w:r>
+              <w:t xml:space="preserve">Tick 2–3 products for a side-by-side table, features read by AI, and a verdict</w:t>
             </w:r>
           </w:p>
         </w:tc>
@@ -1231,7 +1303,7 @@
               <w:pStyle w:val="Compact"/>
             </w:pPr>
             <w:r>
-              <w:t xml:space="preserve">247 backend tests, linting, CI on every backend push</w:t>
+              <w:t xml:space="preserve">264 backend tests, linting, CI on every backend push</w:t>
             </w:r>
           </w:p>
         </w:tc>
@@ -1437,6 +1509,24 @@
         <w:rPr>
           <w:rStyle w:val="VerbatimChar"/>
         </w:rPr>
+        <w:t xml:space="preserve">│   ├── room_service.py            Shop this room</w:t>
+      </w:r>
+      <w:r>
+        <w:br/>
+      </w:r>
+      <w:r>
+        <w:rPr>
+          <w:rStyle w:val="VerbatimChar"/>
+        </w:rPr>
+        <w:t xml:space="preserve">│   ├── planner_service.py         Budget look planner: plan, budget split, picks</w:t>
+      </w:r>
+      <w:r>
+        <w:br/>
+      </w:r>
+      <w:r>
+        <w:rPr>
+          <w:rStyle w:val="VerbatimChar"/>
+        </w:rPr>
         <w:t xml:space="preserve">│   ├── listing_judge.py           AI check that a suggestion's listings are the right item</w:t>
       </w:r>
       <w:r>
@@ -1464,7 +1554,7 @@
         <w:rPr>
           <w:rStyle w:val="VerbatimChar"/>
         </w:rPr>
-        <w:t xml:space="preserve">│   ├── tests/                     247 pytest tests (no network: providers are faked)</w:t>
+        <w:t xml:space="preserve">│   ├── tests/                     264 pytest tests (no network: providers are faked)</w:t>
       </w:r>
       <w:r>
         <w:br/>
@@ -1617,6 +1707,24 @@
         <w:rPr>
           <w:rStyle w:val="VerbatimChar"/>
         </w:rPr>
+        <w:t xml:space="preserve">        │   ├── PlanPanel.jsx           Budget look planner form (the "Plan" tab)</w:t>
+      </w:r>
+      <w:r>
+        <w:br/>
+      </w:r>
+      <w:r>
+        <w:rPr>
+          <w:rStyle w:val="VerbatimChar"/>
+        </w:rPr>
+        <w:t xml:space="preserve">        │   ├── CompareDialog.jsx       Compare bar and side-by-side dialog</w:t>
+      </w:r>
+      <w:r>
+        <w:br/>
+      </w:r>
+      <w:r>
+        <w:rPr>
+          <w:rStyle w:val="VerbatimChar"/>
+        </w:rPr>
         <w:t xml:space="preserve">        │   ├── ColoursDialog.jsx       Colours that suit you</w:t>
       </w:r>
       <w:r>
@@ -1783,7 +1891,7 @@
       </w:r>
     </w:p>
     <w:bookmarkEnd w:id="19"/>
-    <w:bookmarkStart w:id="29" w:name="features-in-detail"/>
+    <w:bookmarkStart w:id="32" w:name="features-in-detail"/>
     <w:p>
       <w:pPr>
         <w:pStyle w:val="Heading2"/>
@@ -2346,13 +2454,13 @@
       </w:r>
     </w:p>
     <w:bookmarkEnd w:id="26"/>
-    <w:bookmarkStart w:id="27" w:name="ask-ai-shopping-assistant"/>
+    <w:bookmarkStart w:id="27" w:name="plan-on-a-budget"/>
     <w:p>
       <w:pPr>
         <w:pStyle w:val="Heading3"/>
       </w:pPr>
       <w:r>
-        <w:t xml:space="preserve">Ask AI (shopping assistant)</w:t>
+        <w:t xml:space="preserve">Plan on a budget</w:t>
       </w:r>
     </w:p>
     <w:p>
@@ -2360,41 +2468,7 @@
         <w:pStyle w:val="FirstParagraph"/>
       </w:pPr>
       <w:r>
-        <w:t xml:space="preserve">A chat panel over the results. The model sees only the listings on screen (name, price, store, rating, reviews), answers in English, Hindi or Hinglish, links its picks and can suggest a new search. Code:</w:t>
-      </w:r>
-      <w:r>
-        <w:t xml:space="preserve"> </w:t>
-      </w:r>
-      <w:r>
-        <w:rPr>
-          <w:rStyle w:val="VerbatimChar"/>
-        </w:rPr>
-        <w:t xml:space="preserve">assistant_service.py</w:t>
-      </w:r>
-      <w:r>
-        <w:t xml:space="preserve">,</w:t>
-      </w:r>
-      <w:r>
-        <w:t xml:space="preserve"> </w:t>
-      </w:r>
-      <w:r>
-        <w:rPr>
-          <w:rStyle w:val="VerbatimChar"/>
-        </w:rPr>
-        <w:t xml:space="preserve">AssistantChat.jsx</w:t>
-      </w:r>
-      <w:r>
-        <w:t xml:space="preserve">.</w:t>
-      </w:r>
-    </w:p>
-    <w:bookmarkEnd w:id="27"/>
-    <w:bookmarkStart w:id="28" w:name="try-on"/>
-    <w:p>
-      <w:pPr>
-        <w:pStyle w:val="Heading3"/>
-      </w:pPr>
-      <w:r>
-        <w:t xml:space="preserve">Try on</w:t>
+        <w:t xml:space="preserve">The "Plan" tab takes an occasion, who it's for and a total budget (or a budget in the sentence, such as "2k tak").</w:t>
       </w:r>
     </w:p>
     <w:p>
@@ -2406,41 +2480,7 @@
         </w:numPr>
       </w:pPr>
       <w:r>
-        <w:rPr>
-          <w:b/>
-          <w:bCs/>
-        </w:rPr>
-        <w:t xml:space="preserve">Clothes:</w:t>
-      </w:r>
-      <w:r>
-        <w:t xml:space="preserve"> </w:t>
-      </w:r>
-      <w:r>
-        <w:t xml:space="preserve">the user's photo and the garment go to free Hugging Face try-on models (Leffa, IDM-VTON); about 20–40 s. Code:</w:t>
-      </w:r>
-      <w:r>
-        <w:t xml:space="preserve"> </w:t>
-      </w:r>
-      <w:r>
-        <w:rPr>
-          <w:rStyle w:val="VerbatimChar"/>
-        </w:rPr>
-        <w:t xml:space="preserve">tryon_service.py</w:t>
-      </w:r>
-      <w:r>
-        <w:t xml:space="preserve">,</w:t>
-      </w:r>
-      <w:r>
-        <w:t xml:space="preserve"> </w:t>
-      </w:r>
-      <w:r>
-        <w:rPr>
-          <w:rStyle w:val="VerbatimChar"/>
-        </w:rPr>
-        <w:t xml:space="preserve">TryOnDialog.jsx</w:t>
-      </w:r>
-      <w:r>
-        <w:t xml:space="preserve">.</w:t>
+        <w:t xml:space="preserve">A Groq model plans 3–5 wearable pieces and splits the budget between them.</w:t>
       </w:r>
     </w:p>
     <w:p>
@@ -2452,10 +2492,255 @@
         </w:numPr>
       </w:pPr>
       <w:r>
+        <w:t xml:space="preserve">Each piece is searched; the listing judge keeps the right items within that piece's share.</w:t>
+      </w:r>
+    </w:p>
+    <w:p>
+      <w:pPr>
+        <w:pStyle w:val="Compact"/>
+        <w:numPr>
+          <w:ilvl w:val="0"/>
+          <w:numId w:val="1008"/>
+        </w:numPr>
+      </w:pPr>
+      <w:r>
+        <w:t xml:space="preserve">One listing is picked per piece; while the total is over budget, the piece with the most to save steps down to a cheaper option.</w:t>
+      </w:r>
+    </w:p>
+    <w:p>
+      <w:pPr>
+        <w:pStyle w:val="Compact"/>
+        <w:numPr>
+          <w:ilvl w:val="0"/>
+          <w:numId w:val="1008"/>
+        </w:numPr>
+      </w:pPr>
+      <w:r>
+        <w:t xml:space="preserve">The user can swap any piece ("Use in my look"); the total and the budget bar update. Code:</w:t>
+      </w:r>
+      <w:r>
+        <w:t xml:space="preserve"> </w:t>
+      </w:r>
+      <w:r>
+        <w:rPr>
+          <w:rStyle w:val="VerbatimChar"/>
+        </w:rPr>
+        <w:t xml:space="preserve">planner_service.py</w:t>
+      </w:r>
+      <w:r>
+        <w:t xml:space="preserve">,</w:t>
+      </w:r>
+      <w:r>
+        <w:t xml:space="preserve"> </w:t>
+      </w:r>
+      <w:r>
+        <w:rPr>
+          <w:rStyle w:val="VerbatimChar"/>
+        </w:rPr>
+        <w:t xml:space="preserve">PlanPanel.jsx</w:t>
+      </w:r>
+      <w:r>
+        <w:t xml:space="preserve">.</w:t>
+      </w:r>
+    </w:p>
+    <w:bookmarkEnd w:id="27"/>
+    <w:bookmarkStart w:id="28" w:name="shop-this-room"/>
+    <w:p>
+      <w:pPr>
+        <w:pStyle w:val="Heading3"/>
+      </w:pPr>
+      <w:r>
+        <w:t xml:space="preserve">Shop this room</w:t>
+      </w:r>
+    </w:p>
+    <w:p>
+      <w:pPr>
+        <w:pStyle w:val="FirstParagraph"/>
+      </w:pPr>
+      <w:r>
+        <w:t xml:space="preserve">Like Find the outfit, for a room photo: the vision model lists up to 8 pieces of furniture, lighting and decor with boxes; each is searched and re-ranked against its crop, with the price of the whole room. Code:</w:t>
+      </w:r>
+      <w:r>
+        <w:t xml:space="preserve"> </w:t>
+      </w:r>
+      <w:r>
+        <w:rPr>
+          <w:rStyle w:val="VerbatimChar"/>
+        </w:rPr>
+        <w:t xml:space="preserve">room_service.py</w:t>
+      </w:r>
+      <w:r>
+        <w:t xml:space="preserve">.</w:t>
+      </w:r>
+    </w:p>
+    <w:bookmarkEnd w:id="28"/>
+    <w:bookmarkStart w:id="29" w:name="compare"/>
+    <w:p>
+      <w:pPr>
+        <w:pStyle w:val="Heading3"/>
+      </w:pPr>
+      <w:r>
+        <w:t xml:space="preserve">Compare</w:t>
+      </w:r>
+    </w:p>
+    <w:p>
+      <w:pPr>
+        <w:pStyle w:val="FirstParagraph"/>
+      </w:pPr>
+      <w:r>
+        <w:t xml:space="preserve">Every card has a Compare checkbox. With 2 or 3 picked, the compare bar opens a side-by-side table: price, store and rating, the features a Groq model reads from the names (RAM, material, display…), each product's strong points, a best pick and a short verdict. Code:</w:t>
+      </w:r>
+      <w:r>
+        <w:t xml:space="preserve"> </w:t>
+      </w:r>
+      <w:r>
+        <w:rPr>
+          <w:rStyle w:val="VerbatimChar"/>
+        </w:rPr>
+        <w:t xml:space="preserve">compare_products</w:t>
+      </w:r>
+      <w:r>
+        <w:t xml:space="preserve"> </w:t>
+      </w:r>
+      <w:r>
+        <w:t xml:space="preserve">in</w:t>
+      </w:r>
+      <w:r>
+        <w:t xml:space="preserve"> </w:t>
+      </w:r>
+      <w:r>
+        <w:rPr>
+          <w:rStyle w:val="VerbatimChar"/>
+        </w:rPr>
+        <w:t xml:space="preserve">assistant_service.py</w:t>
+      </w:r>
+      <w:r>
+        <w:t xml:space="preserve">,</w:t>
+      </w:r>
+      <w:r>
+        <w:t xml:space="preserve"> </w:t>
+      </w:r>
+      <w:r>
+        <w:rPr>
+          <w:rStyle w:val="VerbatimChar"/>
+        </w:rPr>
+        <w:t xml:space="preserve">CompareDialog.jsx</w:t>
+      </w:r>
+      <w:r>
+        <w:t xml:space="preserve">.</w:t>
+      </w:r>
+    </w:p>
+    <w:bookmarkEnd w:id="29"/>
+    <w:bookmarkStart w:id="30" w:name="ask-ai-shopping-assistant"/>
+    <w:p>
+      <w:pPr>
+        <w:pStyle w:val="Heading3"/>
+      </w:pPr>
+      <w:r>
+        <w:t xml:space="preserve">Ask AI (shopping assistant)</w:t>
+      </w:r>
+    </w:p>
+    <w:p>
+      <w:pPr>
+        <w:pStyle w:val="FirstParagraph"/>
+      </w:pPr>
+      <w:r>
+        <w:t xml:space="preserve">A chat panel over the results. The model sees only the listings on screen (name, price, store, rating, reviews), answers in English, Hindi or Hinglish, links its picks and can suggest a new search. Code:</w:t>
+      </w:r>
+      <w:r>
+        <w:t xml:space="preserve"> </w:t>
+      </w:r>
+      <w:r>
+        <w:rPr>
+          <w:rStyle w:val="VerbatimChar"/>
+        </w:rPr>
+        <w:t xml:space="preserve">assistant_service.py</w:t>
+      </w:r>
+      <w:r>
+        <w:t xml:space="preserve">,</w:t>
+      </w:r>
+      <w:r>
+        <w:t xml:space="preserve"> </w:t>
+      </w:r>
+      <w:r>
+        <w:rPr>
+          <w:rStyle w:val="VerbatimChar"/>
+        </w:rPr>
+        <w:t xml:space="preserve">AssistantChat.jsx</w:t>
+      </w:r>
+      <w:r>
+        <w:t xml:space="preserve">.</w:t>
+      </w:r>
+    </w:p>
+    <w:bookmarkEnd w:id="30"/>
+    <w:bookmarkStart w:id="31" w:name="try-on"/>
+    <w:p>
+      <w:pPr>
+        <w:pStyle w:val="Heading3"/>
+      </w:pPr>
+      <w:r>
+        <w:t xml:space="preserve">Try on</w:t>
+      </w:r>
+    </w:p>
+    <w:p>
+      <w:pPr>
+        <w:pStyle w:val="Compact"/>
+        <w:numPr>
+          <w:ilvl w:val="0"/>
+          <w:numId w:val="1009"/>
+        </w:numPr>
+      </w:pPr>
+      <w:r>
         <w:rPr>
           <w:b/>
           <w:bCs/>
         </w:rPr>
+        <w:t xml:space="preserve">Clothes:</w:t>
+      </w:r>
+      <w:r>
+        <w:t xml:space="preserve"> </w:t>
+      </w:r>
+      <w:r>
+        <w:t xml:space="preserve">the user's photo and the garment go to free Hugging Face try-on models (Leffa, IDM-VTON); about 20–40 s. Code:</w:t>
+      </w:r>
+      <w:r>
+        <w:t xml:space="preserve"> </w:t>
+      </w:r>
+      <w:r>
+        <w:rPr>
+          <w:rStyle w:val="VerbatimChar"/>
+        </w:rPr>
+        <w:t xml:space="preserve">tryon_service.py</w:t>
+      </w:r>
+      <w:r>
+        <w:t xml:space="preserve">,</w:t>
+      </w:r>
+      <w:r>
+        <w:t xml:space="preserve"> </w:t>
+      </w:r>
+      <w:r>
+        <w:rPr>
+          <w:rStyle w:val="VerbatimChar"/>
+        </w:rPr>
+        <w:t xml:space="preserve">TryOnDialog.jsx</w:t>
+      </w:r>
+      <w:r>
+        <w:t xml:space="preserve">.</w:t>
+      </w:r>
+    </w:p>
+    <w:p>
+      <w:pPr>
+        <w:pStyle w:val="Compact"/>
+        <w:numPr>
+          <w:ilvl w:val="0"/>
+          <w:numId w:val="1009"/>
+        </w:numPr>
+      </w:pPr>
+      <w:r>
+        <w:rPr>
+          <w:b/>
+          <w:bCs/>
+        </w:rPr>
         <w:t xml:space="preserve">Glasses and watches:</w:t>
       </w:r>
       <w:r>
@@ -2489,9 +2774,9 @@
         <w:t xml:space="preserve">.</w:t>
       </w:r>
     </w:p>
-    <w:bookmarkEnd w:id="28"/>
-    <w:bookmarkEnd w:id="29"/>
-    <w:bookmarkStart w:id="30" w:name="external-services-and-limits"/>
+    <w:bookmarkEnd w:id="31"/>
+    <w:bookmarkEnd w:id="32"/>
+    <w:bookmarkStart w:id="33" w:name="external-services-and-limits"/>
     <w:p>
       <w:pPr>
         <w:pStyle w:val="Heading2"/>
@@ -3255,8 +3540,8 @@
         <w:t xml:space="preserve">Repeated searches are served from an in-memory cache and cost nothing.</w:t>
       </w:r>
     </w:p>
-    <w:bookmarkEnd w:id="30"/>
-    <w:bookmarkStart w:id="31" w:name="backend-api-reference"/>
+    <w:bookmarkEnd w:id="33"/>
+    <w:bookmarkStart w:id="34" w:name="backend-api-reference"/>
     <w:p>
       <w:pPr>
         <w:pStyle w:val="Heading2"/>
@@ -4299,6 +4584,309 @@
               <w:rPr>
                 <w:rStyle w:val="VerbatimChar"/>
               </w:rPr>
+              <w:t xml:space="preserve">/api/v1/compare</w:t>
+            </w:r>
+          </w:p>
+        </w:tc>
+        <w:tc>
+          <w:tcPr/>
+          <w:p>
+            <w:pPr>
+              <w:pStyle w:val="Compact"/>
+            </w:pPr>
+            <w:r>
+              <w:t xml:space="preserve">JSON</w:t>
+            </w:r>
+            <w:r>
+              <w:t xml:space="preserve"> </w:t>
+            </w:r>
+            <w:r>
+              <w:rPr>
+                <w:rStyle w:val="VerbatimChar"/>
+              </w:rPr>
+              <w:t xml:space="preserve">{products (2–3), query}</w:t>
+            </w:r>
+          </w:p>
+        </w:tc>
+        <w:tc>
+          <w:tcPr/>
+          <w:p>
+            <w:pPr>
+              <w:pStyle w:val="Compact"/>
+            </w:pPr>
+            <w:r>
+              <w:rPr>
+                <w:rStyle w:val="VerbatimChar"/>
+              </w:rPr>
+              <w:t xml:space="preserve">{attributes, pros, best, verdict}</w:t>
+            </w:r>
+          </w:p>
+        </w:tc>
+      </w:tr>
+      <w:tr>
+        <w:tc>
+          <w:tcPr/>
+          <w:p>
+            <w:pPr>
+              <w:pStyle w:val="Compact"/>
+            </w:pPr>
+            <w:r>
+              <w:t xml:space="preserve">POST</w:t>
+            </w:r>
+          </w:p>
+        </w:tc>
+        <w:tc>
+          <w:tcPr/>
+          <w:p>
+            <w:pPr>
+              <w:pStyle w:val="Compact"/>
+            </w:pPr>
+            <w:r>
+              <w:rPr>
+                <w:rStyle w:val="VerbatimChar"/>
+              </w:rPr>
+              <w:t xml:space="preserve">/api/v1/room/stream</w:t>
+            </w:r>
+          </w:p>
+        </w:tc>
+        <w:tc>
+          <w:tcPr/>
+          <w:p>
+            <w:pPr>
+              <w:pStyle w:val="Compact"/>
+            </w:pPr>
+            <w:r>
+              <w:rPr>
+                <w:rStyle w:val="VerbatimChar"/>
+              </w:rPr>
+              <w:t xml:space="preserve">file</w:t>
+            </w:r>
+            <w:r>
+              <w:t xml:space="preserve"> </w:t>
+            </w:r>
+            <w:r>
+              <w:t xml:space="preserve">(room photo)</w:t>
+            </w:r>
+          </w:p>
+        </w:tc>
+        <w:tc>
+          <w:tcPr/>
+          <w:p>
+            <w:pPr>
+              <w:pStyle w:val="Compact"/>
+            </w:pPr>
+            <w:r>
+              <w:t xml:space="preserve">Streams</w:t>
+            </w:r>
+            <w:r>
+              <w:t xml:space="preserve"> </w:t>
+            </w:r>
+            <w:r>
+              <w:rPr>
+                <w:rStyle w:val="VerbatimChar"/>
+              </w:rPr>
+              <w:t xml:space="preserve">items</w:t>
+            </w:r>
+            <w:r>
+              <w:t xml:space="preserve">, one</w:t>
+            </w:r>
+            <w:r>
+              <w:t xml:space="preserve"> </w:t>
+            </w:r>
+            <w:r>
+              <w:rPr>
+                <w:rStyle w:val="VerbatimChar"/>
+              </w:rPr>
+              <w:t xml:space="preserve">item</w:t>
+            </w:r>
+            <w:r>
+              <w:t xml:space="preserve"> </w:t>
+            </w:r>
+            <w:r>
+              <w:t xml:space="preserve">per piece,</w:t>
+            </w:r>
+            <w:r>
+              <w:t xml:space="preserve"> </w:t>
+            </w:r>
+            <w:r>
+              <w:rPr>
+                <w:rStyle w:val="VerbatimChar"/>
+              </w:rPr>
+              <w:t xml:space="preserve">final</w:t>
+            </w:r>
+            <w:r>
+              <w:t xml:space="preserve"> </w:t>
+            </w:r>
+            <w:r>
+              <w:t xml:space="preserve">with</w:t>
+            </w:r>
+            <w:r>
+              <w:t xml:space="preserve"> </w:t>
+            </w:r>
+            <w:r>
+              <w:rPr>
+                <w:rStyle w:val="VerbatimChar"/>
+              </w:rPr>
+              <w:t xml:space="preserve">style</w:t>
+            </w:r>
+          </w:p>
+        </w:tc>
+      </w:tr>
+      <w:tr>
+        <w:tc>
+          <w:tcPr/>
+          <w:p>
+            <w:pPr>
+              <w:pStyle w:val="Compact"/>
+            </w:pPr>
+            <w:r>
+              <w:t xml:space="preserve">POST</w:t>
+            </w:r>
+          </w:p>
+        </w:tc>
+        <w:tc>
+          <w:tcPr/>
+          <w:p>
+            <w:pPr>
+              <w:pStyle w:val="Compact"/>
+            </w:pPr>
+            <w:r>
+              <w:rPr>
+                <w:rStyle w:val="VerbatimChar"/>
+              </w:rPr>
+              <w:t xml:space="preserve">/api/v1/plan/stream</w:t>
+            </w:r>
+          </w:p>
+        </w:tc>
+        <w:tc>
+          <w:tcPr/>
+          <w:p>
+            <w:pPr>
+              <w:pStyle w:val="Compact"/>
+            </w:pPr>
+            <w:r>
+              <w:t xml:space="preserve">JSON</w:t>
+            </w:r>
+            <w:r>
+              <w:t xml:space="preserve"> </w:t>
+            </w:r>
+            <w:r>
+              <w:rPr>
+                <w:rStyle w:val="VerbatimChar"/>
+              </w:rPr>
+              <w:t xml:space="preserve">{request, budget?, gender?}</w:t>
+            </w:r>
+          </w:p>
+        </w:tc>
+        <w:tc>
+          <w:tcPr/>
+          <w:p>
+            <w:pPr>
+              <w:pStyle w:val="Compact"/>
+            </w:pPr>
+            <w:r>
+              <w:t xml:space="preserve">Streams</w:t>
+            </w:r>
+            <w:r>
+              <w:t xml:space="preserve"> </w:t>
+            </w:r>
+            <w:r>
+              <w:rPr>
+                <w:rStyle w:val="VerbatimChar"/>
+              </w:rPr>
+              <w:t xml:space="preserve">plan</w:t>
+            </w:r>
+            <w:r>
+              <w:t xml:space="preserve">,</w:t>
+            </w:r>
+            <w:r>
+              <w:t xml:space="preserve"> </w:t>
+            </w:r>
+            <w:r>
+              <w:rPr>
+                <w:rStyle w:val="VerbatimChar"/>
+              </w:rPr>
+              <w:t xml:space="preserve">items</w:t>
+            </w:r>
+            <w:r>
+              <w:t xml:space="preserve">,</w:t>
+            </w:r>
+            <w:r>
+              <w:t xml:space="preserve"> </w:t>
+            </w:r>
+            <w:r>
+              <w:rPr>
+                <w:rStyle w:val="VerbatimChar"/>
+              </w:rPr>
+              <w:t xml:space="preserve">item</w:t>
+            </w:r>
+            <w:r>
+              <w:t xml:space="preserve">,</w:t>
+            </w:r>
+            <w:r>
+              <w:t xml:space="preserve"> </w:t>
+            </w:r>
+            <w:r>
+              <w:rPr>
+                <w:rStyle w:val="VerbatimChar"/>
+              </w:rPr>
+              <w:t xml:space="preserve">final</w:t>
+            </w:r>
+            <w:r>
+              <w:t xml:space="preserve"> </w:t>
+            </w:r>
+            <w:r>
+              <w:t xml:space="preserve">with</w:t>
+            </w:r>
+            <w:r>
+              <w:t xml:space="preserve"> </w:t>
+            </w:r>
+            <w:r>
+              <w:rPr>
+                <w:rStyle w:val="VerbatimChar"/>
+              </w:rPr>
+              <w:t xml:space="preserve">picks</w:t>
+            </w:r>
+            <w:r>
+              <w:t xml:space="preserve"> </w:t>
+            </w:r>
+            <w:r>
+              <w:t xml:space="preserve">and</w:t>
+            </w:r>
+            <w:r>
+              <w:t xml:space="preserve"> </w:t>
+            </w:r>
+            <w:r>
+              <w:rPr>
+                <w:rStyle w:val="VerbatimChar"/>
+              </w:rPr>
+              <w:t xml:space="preserve">total</w:t>
+            </w:r>
+          </w:p>
+        </w:tc>
+      </w:tr>
+      <w:tr>
+        <w:tc>
+          <w:tcPr/>
+          <w:p>
+            <w:pPr>
+              <w:pStyle w:val="Compact"/>
+            </w:pPr>
+            <w:r>
+              <w:t xml:space="preserve">POST</w:t>
+            </w:r>
+          </w:p>
+        </w:tc>
+        <w:tc>
+          <w:tcPr/>
+          <w:p>
+            <w:pPr>
+              <w:pStyle w:val="Compact"/>
+            </w:pPr>
+            <w:r>
+              <w:rPr>
+                <w:rStyle w:val="VerbatimChar"/>
+              </w:rPr>
               <w:t xml:space="preserve">/api/v1/tryon</w:t>
             </w:r>
           </w:p>
@@ -4459,8 +5047,8 @@
         <w:t xml:space="preserve">).</w:t>
       </w:r>
     </w:p>
-    <w:bookmarkEnd w:id="31"/>
-    <w:bookmarkStart w:id="32" w:name="running-it-locally"/>
+    <w:bookmarkEnd w:id="34"/>
+    <w:bookmarkStart w:id="35" w:name="running-it-locally"/>
     <w:p>
       <w:pPr>
         <w:pStyle w:val="Heading2"/>
@@ -4812,7 +5400,7 @@
         <w:pStyle w:val="Compact"/>
         <w:numPr>
           <w:ilvl w:val="0"/>
-          <w:numId w:val="1009"/>
+          <w:numId w:val="1010"/>
         </w:numPr>
       </w:pPr>
       <w:r>
@@ -4854,7 +5442,7 @@
         <w:pStyle w:val="Compact"/>
         <w:numPr>
           <w:ilvl w:val="0"/>
-          <w:numId w:val="1009"/>
+          <w:numId w:val="1010"/>
         </w:numPr>
       </w:pPr>
       <w:r>
@@ -4890,7 +5478,7 @@
         <w:pStyle w:val="Compact"/>
         <w:numPr>
           <w:ilvl w:val="0"/>
-          <w:numId w:val="1009"/>
+          <w:numId w:val="1010"/>
         </w:numPr>
       </w:pPr>
       <w:r>
@@ -4911,7 +5499,7 @@
         <w:pStyle w:val="Compact"/>
         <w:numPr>
           <w:ilvl w:val="0"/>
-          <w:numId w:val="1009"/>
+          <w:numId w:val="1010"/>
         </w:numPr>
       </w:pPr>
       <w:r>
@@ -4932,7 +5520,7 @@
         <w:pStyle w:val="Compact"/>
         <w:numPr>
           <w:ilvl w:val="0"/>
-          <w:numId w:val="1009"/>
+          <w:numId w:val="1010"/>
         </w:numPr>
       </w:pPr>
       <w:r>
@@ -4968,8 +5556,8 @@
         <w:t xml:space="preserve">; the reloader can stall. After changing backend code, restart the server.</w:t>
       </w:r>
     </w:p>
-    <w:bookmarkEnd w:id="32"/>
-    <w:bookmarkStart w:id="33" w:name="testing-and-quality-checks"/>
+    <w:bookmarkEnd w:id="35"/>
+    <w:bookmarkStart w:id="36" w:name="testing-and-quality-checks"/>
     <w:p>
       <w:pPr>
         <w:pStyle w:val="Heading2"/>
@@ -5068,7 +5656,7 @@
               <w:pStyle w:val="Compact"/>
             </w:pPr>
             <w:r>
-              <w:t xml:space="preserve">247 tests: ranking, prices, Hinglish parsing, outfit, rating, colours, judge, API routes</w:t>
+              <w:t xml:space="preserve">264 tests: ranking, prices, Hinglish parsing, outfit, rating, colours, judge, API routes</w:t>
             </w:r>
           </w:p>
         </w:tc>
@@ -5187,8 +5775,8 @@
         <w:t xml:space="preserve">New features were also checked end to end in Chrome with headless browser scripts (upload a photo, click through, screenshot), against the real services.</w:t>
       </w:r>
     </w:p>
-    <w:bookmarkEnd w:id="33"/>
-    <w:bookmarkStart w:id="34" w:name="deployment-on-vercel"/>
+    <w:bookmarkEnd w:id="36"/>
+    <w:bookmarkStart w:id="37" w:name="deployment-on-vercel"/>
     <w:p>
       <w:pPr>
         <w:pStyle w:val="Heading2"/>
@@ -5433,7 +6021,7 @@
         <w:pStyle w:val="Compact"/>
         <w:numPr>
           <w:ilvl w:val="0"/>
-          <w:numId w:val="1010"/>
+          <w:numId w:val="1011"/>
         </w:numPr>
       </w:pPr>
       <w:r>
@@ -5445,7 +6033,7 @@
         <w:pStyle w:val="Compact"/>
         <w:numPr>
           <w:ilvl w:val="0"/>
-          <w:numId w:val="1010"/>
+          <w:numId w:val="1011"/>
         </w:numPr>
       </w:pPr>
       <w:r>
@@ -5463,7 +6051,7 @@
         <w:pStyle w:val="Compact"/>
         <w:numPr>
           <w:ilvl w:val="0"/>
-          <w:numId w:val="1010"/>
+          <w:numId w:val="1011"/>
         </w:numPr>
       </w:pPr>
       <w:r>
@@ -5515,7 +6103,7 @@
         <w:pStyle w:val="Compact"/>
         <w:numPr>
           <w:ilvl w:val="0"/>
-          <w:numId w:val="1010"/>
+          <w:numId w:val="1011"/>
         </w:numPr>
       </w:pPr>
       <w:r>
@@ -5609,8 +6197,8 @@
         <w:t xml:space="preserve">. The first search after a quiet period is slower while it loads (a cold start).</w:t>
       </w:r>
     </w:p>
-    <w:bookmarkEnd w:id="34"/>
-    <w:bookmarkStart w:id="35" w:name="troubleshooting-limits-and-glossary"/>
+    <w:bookmarkEnd w:id="37"/>
+    <w:bookmarkStart w:id="38" w:name="troubleshooting-limits-and-glossary"/>
     <w:p>
       <w:pPr>
         <w:pStyle w:val="Heading2"/>
@@ -6338,7 +6926,7 @@
         </w:tc>
       </w:tr>
     </w:tbl>
-    <w:bookmarkEnd w:id="35"/>
+    <w:bookmarkEnd w:id="38"/>
     <w:sectPr>
       <w:footnotePr>
         <w:numRestart w:val="eachSect"/>
@@ -6797,12 +7385,42 @@
     </w:lvlOverride>
   </w:num>
   <w:num w:numId="1008">
-    <w:abstractNumId w:val="991"/>
+    <w:abstractNumId w:val="99411"/>
+    <w:lvlOverride w:ilvl="0">
+      <w:startOverride w:val="1"/>
+    </w:lvlOverride>
+    <w:lvlOverride w:ilvl="1">
+      <w:startOverride w:val="1"/>
+    </w:lvlOverride>
+    <w:lvlOverride w:ilvl="2">
+      <w:startOverride w:val="1"/>
+    </w:lvlOverride>
+    <w:lvlOverride w:ilvl="3">
+      <w:startOverride w:val="1"/>
+    </w:lvlOverride>
+    <w:lvlOverride w:ilvl="4">
+      <w:startOverride w:val="1"/>
+    </w:lvlOverride>
+    <w:lvlOverride w:ilvl="5">
+      <w:startOverride w:val="1"/>
+    </w:lvlOverride>
+    <w:lvlOverride w:ilvl="6">
+      <w:startOverride w:val="1"/>
+    </w:lvlOverride>
+    <w:lvlOverride w:ilvl="7">
+      <w:startOverride w:val="1"/>
+    </w:lvlOverride>
+    <w:lvlOverride w:ilvl="8">
+      <w:startOverride w:val="1"/>
+    </w:lvlOverride>
   </w:num>
   <w:num w:numId="1009">
     <w:abstractNumId w:val="991"/>
   </w:num>
   <w:num w:numId="1010">
+    <w:abstractNumId w:val="991"/>
+  </w:num>
+  <w:num w:numId="1011">
     <w:abstractNumId w:val="99411"/>
     <w:lvlOverride w:ilvl="0">
       <w:startOverride w:val="1"/>

</xml_diff>

<commit_message>
Add a gift finder, Shop my list and price-drop alerts
- Gift finder ("Gift" tab): who it's for, the occasion, what they like
  and a budget in any words; a Groq model suggests six varied ideas,
  each searched and checked by the listing judge within budget.
- Shop my list: a photo of a handwritten list or chat screenshot, or a
  typed list; each line is read (Hindi/Hinglish too) with quantity and
  budget, searched and checked; the best listing at about the typical
  price is picked per line and the cart total counts quantities.
- Price watch: a bell on every card; watches live in the browser and are
  re-checked when the app opens (every 12 hours) from the store page or
  the same store's closely matching Google Shopping listing. Drops show
  a banner and a browser notification; Saved lists each watch with its
  history.

Co-Authored-By: Claude Opus 5.5 <noreply@anthropic.com>
</commit_message>
<xml_diff>
--- a/docs/SnapBuy AI - Project Guide.docx
+++ b/docs/SnapBuy AI - Project Guide.docx
@@ -452,6 +452,78 @@
             </w:pPr>
             <w:r>
               <w:t xml:space="preserve">Tick 2–3 products for a side-by-side table, features read by AI, and a verdict</w:t>
+            </w:r>
+          </w:p>
+        </w:tc>
+      </w:tr>
+      <w:tr>
+        <w:tc>
+          <w:tcPr/>
+          <w:p>
+            <w:pPr>
+              <w:pStyle w:val="Compact"/>
+            </w:pPr>
+            <w:r>
+              <w:t xml:space="preserve">Find a gift</w:t>
+            </w:r>
+          </w:p>
+        </w:tc>
+        <w:tc>
+          <w:tcPr/>
+          <w:p>
+            <w:pPr>
+              <w:pStyle w:val="Compact"/>
+            </w:pPr>
+            <w:r>
+              <w:t xml:space="preserve">"Bhai ke liye, gym ka shauk, 2000 tak" → six gift ideas with listings</w:t>
+            </w:r>
+          </w:p>
+        </w:tc>
+      </w:tr>
+      <w:tr>
+        <w:tc>
+          <w:tcPr/>
+          <w:p>
+            <w:pPr>
+              <w:pStyle w:val="Compact"/>
+            </w:pPr>
+            <w:r>
+              <w:t xml:space="preserve">Shop my list</w:t>
+            </w:r>
+          </w:p>
+        </w:tc>
+        <w:tc>
+          <w:tcPr/>
+          <w:p>
+            <w:pPr>
+              <w:pStyle w:val="Compact"/>
+            </w:pPr>
+            <w:r>
+              <w:t xml:space="preserve">A photo of a handwritten list (or a typed one) → every item found, one cart total</w:t>
+            </w:r>
+          </w:p>
+        </w:tc>
+      </w:tr>
+      <w:tr>
+        <w:tc>
+          <w:tcPr/>
+          <w:p>
+            <w:pPr>
+              <w:pStyle w:val="Compact"/>
+            </w:pPr>
+            <w:r>
+              <w:t xml:space="preserve">Price watch</w:t>
+            </w:r>
+          </w:p>
+        </w:tc>
+        <w:tc>
+          <w:tcPr/>
+          <w:p>
+            <w:pPr>
+              <w:pStyle w:val="Compact"/>
+            </w:pPr>
+            <w:r>
+              <w:t xml:space="preserve">Tap the bell on a product; drops show as a banner and browser notification</w:t>
             </w:r>
           </w:p>
         </w:tc>
@@ -1303,7 +1375,7 @@
               <w:pStyle w:val="Compact"/>
             </w:pPr>
             <w:r>
-              <w:t xml:space="preserve">264 backend tests, linting, CI on every backend push</w:t>
+              <w:t xml:space="preserve">280 backend tests, linting, CI on every backend push</w:t>
             </w:r>
           </w:p>
         </w:tc>
@@ -1527,6 +1599,33 @@
         <w:rPr>
           <w:rStyle w:val="VerbatimChar"/>
         </w:rPr>
+        <w:t xml:space="preserve">│   ├── gift_service.py            Gift finder</w:t>
+      </w:r>
+      <w:r>
+        <w:br/>
+      </w:r>
+      <w:r>
+        <w:rPr>
+          <w:rStyle w:val="VerbatimChar"/>
+        </w:rPr>
+        <w:t xml:space="preserve">│   ├── list_service.py            Shop my list (photo or typed)</w:t>
+      </w:r>
+      <w:r>
+        <w:br/>
+      </w:r>
+      <w:r>
+        <w:rPr>
+          <w:rStyle w:val="VerbatimChar"/>
+        </w:rPr>
+        <w:t xml:space="preserve">│   ├── price_watch_service.py     Re-checks watched prices</w:t>
+      </w:r>
+      <w:r>
+        <w:br/>
+      </w:r>
+      <w:r>
+        <w:rPr>
+          <w:rStyle w:val="VerbatimChar"/>
+        </w:rPr>
         <w:t xml:space="preserve">│   ├── listing_judge.py           AI check that a suggestion's listings are the right item</w:t>
       </w:r>
       <w:r>
@@ -1554,7 +1653,7 @@
         <w:rPr>
           <w:rStyle w:val="VerbatimChar"/>
         </w:rPr>
-        <w:t xml:space="preserve">│   ├── tests/                     264 pytest tests (no network: providers are faked)</w:t>
+        <w:t xml:space="preserve">│   ├── tests/                     280 pytest tests (no network: providers are faked)</w:t>
       </w:r>
       <w:r>
         <w:br/>
@@ -1716,6 +1815,24 @@
         <w:rPr>
           <w:rStyle w:val="VerbatimChar"/>
         </w:rPr>
+        <w:t xml:space="preserve">        │   ├── GiftPanel.jsx           Gift finder form (the "Gift" tab)</w:t>
+      </w:r>
+      <w:r>
+        <w:br/>
+      </w:r>
+      <w:r>
+        <w:rPr>
+          <w:rStyle w:val="VerbatimChar"/>
+        </w:rPr>
+        <w:t xml:space="preserve">        │   ├── PriceWatch.jsx          Price watch list on the Saved page</w:t>
+      </w:r>
+      <w:r>
+        <w:br/>
+      </w:r>
+      <w:r>
+        <w:rPr>
+          <w:rStyle w:val="VerbatimChar"/>
+        </w:rPr>
         <w:t xml:space="preserve">        │   ├── CompareDialog.jsx       Compare bar and side-by-side dialog</w:t>
       </w:r>
       <w:r>
@@ -1891,7 +2008,7 @@
       </w:r>
     </w:p>
     <w:bookmarkEnd w:id="19"/>
-    <w:bookmarkStart w:id="32" w:name="features-in-detail"/>
+    <w:bookmarkStart w:id="35" w:name="features-in-detail"/>
     <w:p>
       <w:pPr>
         <w:pStyle w:val="Heading2"/>
@@ -2544,12 +2661,138 @@
       </w:r>
     </w:p>
     <w:bookmarkEnd w:id="27"/>
-    <w:bookmarkStart w:id="28" w:name="shop-this-room"/>
+    <w:bookmarkStart w:id="28" w:name="find-a-gift"/>
     <w:p>
       <w:pPr>
         <w:pStyle w:val="Heading3"/>
       </w:pPr>
       <w:r>
+        <w:t xml:space="preserve">Find a gift</w:t>
+      </w:r>
+    </w:p>
+    <w:p>
+      <w:pPr>
+        <w:pStyle w:val="FirstParagraph"/>
+      </w:pPr>
+      <w:r>
+        <w:t xml:space="preserve">The "Gift" tab: chips for who it's for and the occasion, what they like and a budget (Hindi and Hinglish work). A Groq model suggests six varied ideas with a reason each; each is searched, checked by the listing judge, and listings well over the budget are dropped. Code:</w:t>
+      </w:r>
+      <w:r>
+        <w:t xml:space="preserve"> </w:t>
+      </w:r>
+      <w:r>
+        <w:rPr>
+          <w:rStyle w:val="VerbatimChar"/>
+        </w:rPr>
+        <w:t xml:space="preserve">gift_service.py</w:t>
+      </w:r>
+      <w:r>
+        <w:t xml:space="preserve">,</w:t>
+      </w:r>
+      <w:r>
+        <w:t xml:space="preserve"> </w:t>
+      </w:r>
+      <w:r>
+        <w:rPr>
+          <w:rStyle w:val="VerbatimChar"/>
+        </w:rPr>
+        <w:t xml:space="preserve">GiftPanel.jsx</w:t>
+      </w:r>
+      <w:r>
+        <w:t xml:space="preserve">.</w:t>
+      </w:r>
+    </w:p>
+    <w:bookmarkEnd w:id="28"/>
+    <w:bookmarkStart w:id="29" w:name="shop-my-list"/>
+    <w:p>
+      <w:pPr>
+        <w:pStyle w:val="Heading3"/>
+      </w:pPr>
+      <w:r>
+        <w:t xml:space="preserve">Shop my list</w:t>
+      </w:r>
+    </w:p>
+    <w:p>
+      <w:pPr>
+        <w:pStyle w:val="FirstParagraph"/>
+      </w:pPr>
+      <w:r>
+        <w:t xml:space="preserve">A photo of a handwritten list or chat screenshot ("Shop my list" under Photo), or a typed list ("Have a whole list?" under Text). AI reads each line into an English search with quantity and any written budget; each is searched and checked; the best listing at about the typical price is picked per line and the cart total counts quantities. Code:</w:t>
+      </w:r>
+      <w:r>
+        <w:t xml:space="preserve"> </w:t>
+      </w:r>
+      <w:r>
+        <w:rPr>
+          <w:rStyle w:val="VerbatimChar"/>
+        </w:rPr>
+        <w:t xml:space="preserve">list_service.py</w:t>
+      </w:r>
+      <w:r>
+        <w:t xml:space="preserve">.</w:t>
+      </w:r>
+    </w:p>
+    <w:bookmarkEnd w:id="29"/>
+    <w:bookmarkStart w:id="30" w:name="price-watch"/>
+    <w:p>
+      <w:pPr>
+        <w:pStyle w:val="Heading3"/>
+      </w:pPr>
+      <w:r>
+        <w:t xml:space="preserve">Price watch</w:t>
+      </w:r>
+    </w:p>
+    <w:p>
+      <w:pPr>
+        <w:pStyle w:val="FirstParagraph"/>
+      </w:pPr>
+      <w:r>
+        <w:t xml:space="preserve">The bell on a card adds it to a watch list kept in the browser. When the app opens, watches older than 12 hours are re-checked: from the store page, or the same store's closely matching Google Shopping listing (a jump over 60% is treated as a different product, not a drop). Drops show a banner and a browser notification; the Saved page shows each watch's history. Alerts appear when the app is opened, not while it is closed. Code:</w:t>
+      </w:r>
+      <w:r>
+        <w:t xml:space="preserve"> </w:t>
+      </w:r>
+      <w:r>
+        <w:rPr>
+          <w:rStyle w:val="VerbatimChar"/>
+        </w:rPr>
+        <w:t xml:space="preserve">price_watch_service.py</w:t>
+      </w:r>
+      <w:r>
+        <w:t xml:space="preserve">,</w:t>
+      </w:r>
+      <w:r>
+        <w:t xml:space="preserve"> </w:t>
+      </w:r>
+      <w:r>
+        <w:rPr>
+          <w:rStyle w:val="VerbatimChar"/>
+        </w:rPr>
+        <w:t xml:space="preserve">priceWatch.js</w:t>
+      </w:r>
+      <w:r>
+        <w:t xml:space="preserve">,</w:t>
+      </w:r>
+      <w:r>
+        <w:t xml:space="preserve"> </w:t>
+      </w:r>
+      <w:r>
+        <w:rPr>
+          <w:rStyle w:val="VerbatimChar"/>
+        </w:rPr>
+        <w:t xml:space="preserve">PriceWatch.jsx</w:t>
+      </w:r>
+      <w:r>
+        <w:t xml:space="preserve">.</w:t>
+      </w:r>
+    </w:p>
+    <w:bookmarkEnd w:id="30"/>
+    <w:bookmarkStart w:id="31" w:name="shop-this-room"/>
+    <w:p>
+      <w:pPr>
+        <w:pStyle w:val="Heading3"/>
+      </w:pPr>
+      <w:r>
         <w:t xml:space="preserve">Shop this room</w:t>
       </w:r>
     </w:p>
@@ -2573,8 +2816,8 @@
         <w:t xml:space="preserve">.</w:t>
       </w:r>
     </w:p>
-    <w:bookmarkEnd w:id="28"/>
-    <w:bookmarkStart w:id="29" w:name="compare"/>
+    <w:bookmarkEnd w:id="31"/>
+    <w:bookmarkStart w:id="32" w:name="compare"/>
     <w:p>
       <w:pPr>
         <w:pStyle w:val="Heading3"/>
@@ -2630,8 +2873,8 @@
         <w:t xml:space="preserve">.</w:t>
       </w:r>
     </w:p>
-    <w:bookmarkEnd w:id="29"/>
-    <w:bookmarkStart w:id="30" w:name="ask-ai-shopping-assistant"/>
+    <w:bookmarkEnd w:id="32"/>
+    <w:bookmarkStart w:id="33" w:name="ask-ai-shopping-assistant"/>
     <w:p>
       <w:pPr>
         <w:pStyle w:val="Heading3"/>
@@ -2672,8 +2915,8 @@
         <w:t xml:space="preserve">.</w:t>
       </w:r>
     </w:p>
-    <w:bookmarkEnd w:id="30"/>
-    <w:bookmarkStart w:id="31" w:name="try-on"/>
+    <w:bookmarkEnd w:id="33"/>
+    <w:bookmarkStart w:id="34" w:name="try-on"/>
     <w:p>
       <w:pPr>
         <w:pStyle w:val="Heading3"/>
@@ -2774,9 +3017,9 @@
         <w:t xml:space="preserve">.</w:t>
       </w:r>
     </w:p>
-    <w:bookmarkEnd w:id="31"/>
-    <w:bookmarkEnd w:id="32"/>
-    <w:bookmarkStart w:id="33" w:name="external-services-and-limits"/>
+    <w:bookmarkEnd w:id="34"/>
+    <w:bookmarkEnd w:id="35"/>
+    <w:bookmarkStart w:id="36" w:name="external-services-and-limits"/>
     <w:p>
       <w:pPr>
         <w:pStyle w:val="Heading2"/>
@@ -3531,6 +3774,59 @@
           </w:p>
         </w:tc>
       </w:tr>
+      <w:tr>
+        <w:tc>
+          <w:tcPr/>
+          <w:p>
+            <w:pPr>
+              <w:pStyle w:val="Compact"/>
+            </w:pPr>
+            <w:r>
+              <w:rPr>
+                <w:rStyle w:val="VerbatimChar"/>
+              </w:rPr>
+              <w:t xml:space="preserve">WATCH_LIMIT</w:t>
+            </w:r>
+            <w:r>
+              <w:t xml:space="preserve"> </w:t>
+            </w:r>
+            <w:r>
+              <w:t xml:space="preserve">/</w:t>
+            </w:r>
+            <w:r>
+              <w:t xml:space="preserve"> </w:t>
+            </w:r>
+            <w:r>
+              <w:rPr>
+                <w:rStyle w:val="VerbatimChar"/>
+              </w:rPr>
+              <w:t xml:space="preserve">WATCH_WINDOW_SECONDS</w:t>
+            </w:r>
+          </w:p>
+        </w:tc>
+        <w:tc>
+          <w:tcPr/>
+          <w:p>
+            <w:pPr>
+              <w:pStyle w:val="Compact"/>
+            </w:pPr>
+            <w:r>
+              <w:t xml:space="preserve">6 per 3600 s</w:t>
+            </w:r>
+          </w:p>
+        </w:tc>
+        <w:tc>
+          <w:tcPr/>
+          <w:p>
+            <w:pPr>
+              <w:pStyle w:val="Compact"/>
+            </w:pPr>
+            <w:r>
+              <w:t xml:space="preserve">Price-watch checks (each may use a Google Shopping search per product)</w:t>
+            </w:r>
+          </w:p>
+        </w:tc>
+      </w:tr>
     </w:tbl>
     <w:p>
       <w:pPr>
@@ -3540,8 +3836,8 @@
         <w:t xml:space="preserve">Repeated searches are served from an in-memory cache and cost nothing.</w:t>
       </w:r>
     </w:p>
-    <w:bookmarkEnd w:id="33"/>
-    <w:bookmarkStart w:id="34" w:name="backend-api-reference"/>
+    <w:bookmarkEnd w:id="36"/>
+    <w:bookmarkStart w:id="37" w:name="backend-api-reference"/>
     <w:p>
       <w:pPr>
         <w:pStyle w:val="Heading2"/>
@@ -4887,6 +5183,315 @@
               <w:rPr>
                 <w:rStyle w:val="VerbatimChar"/>
               </w:rPr>
+              <w:t xml:space="preserve">/api/v1/gifts/stream</w:t>
+            </w:r>
+          </w:p>
+        </w:tc>
+        <w:tc>
+          <w:tcPr/>
+          <w:p>
+            <w:pPr>
+              <w:pStyle w:val="Compact"/>
+            </w:pPr>
+            <w:r>
+              <w:t xml:space="preserve">JSON</w:t>
+            </w:r>
+            <w:r>
+              <w:t xml:space="preserve"> </w:t>
+            </w:r>
+            <w:r>
+              <w:rPr>
+                <w:rStyle w:val="VerbatimChar"/>
+              </w:rPr>
+              <w:t xml:space="preserve">{request, budget?}</w:t>
+            </w:r>
+          </w:p>
+        </w:tc>
+        <w:tc>
+          <w:tcPr/>
+          <w:p>
+            <w:pPr>
+              <w:pStyle w:val="Compact"/>
+            </w:pPr>
+            <w:r>
+              <w:t xml:space="preserve">Streams</w:t>
+            </w:r>
+            <w:r>
+              <w:t xml:space="preserve"> </w:t>
+            </w:r>
+            <w:r>
+              <w:rPr>
+                <w:rStyle w:val="VerbatimChar"/>
+              </w:rPr>
+              <w:t xml:space="preserve">gifts</w:t>
+            </w:r>
+            <w:r>
+              <w:t xml:space="preserve">,</w:t>
+            </w:r>
+            <w:r>
+              <w:t xml:space="preserve"> </w:t>
+            </w:r>
+            <w:r>
+              <w:rPr>
+                <w:rStyle w:val="VerbatimChar"/>
+              </w:rPr>
+              <w:t xml:space="preserve">items</w:t>
+            </w:r>
+            <w:r>
+              <w:t xml:space="preserve">,</w:t>
+            </w:r>
+            <w:r>
+              <w:t xml:space="preserve"> </w:t>
+            </w:r>
+            <w:r>
+              <w:rPr>
+                <w:rStyle w:val="VerbatimChar"/>
+              </w:rPr>
+              <w:t xml:space="preserve">item</w:t>
+            </w:r>
+            <w:r>
+              <w:t xml:space="preserve">,</w:t>
+            </w:r>
+            <w:r>
+              <w:t xml:space="preserve"> </w:t>
+            </w:r>
+            <w:r>
+              <w:rPr>
+                <w:rStyle w:val="VerbatimChar"/>
+              </w:rPr>
+              <w:t xml:space="preserve">final</w:t>
+            </w:r>
+          </w:p>
+        </w:tc>
+      </w:tr>
+      <w:tr>
+        <w:tc>
+          <w:tcPr/>
+          <w:p>
+            <w:pPr>
+              <w:pStyle w:val="Compact"/>
+            </w:pPr>
+            <w:r>
+              <w:t xml:space="preserve">POST</w:t>
+            </w:r>
+          </w:p>
+        </w:tc>
+        <w:tc>
+          <w:tcPr/>
+          <w:p>
+            <w:pPr>
+              <w:pStyle w:val="Compact"/>
+            </w:pPr>
+            <w:r>
+              <w:rPr>
+                <w:rStyle w:val="VerbatimChar"/>
+              </w:rPr>
+              <w:t xml:space="preserve">/api/v1/list/stream</w:t>
+            </w:r>
+          </w:p>
+        </w:tc>
+        <w:tc>
+          <w:tcPr/>
+          <w:p>
+            <w:pPr>
+              <w:pStyle w:val="Compact"/>
+            </w:pPr>
+            <w:r>
+              <w:rPr>
+                <w:rStyle w:val="VerbatimChar"/>
+              </w:rPr>
+              <w:t xml:space="preserve">file</w:t>
+            </w:r>
+            <w:r>
+              <w:t xml:space="preserve"> </w:t>
+            </w:r>
+            <w:r>
+              <w:t xml:space="preserve">(photo of a list) or</w:t>
+            </w:r>
+            <w:r>
+              <w:t xml:space="preserve"> </w:t>
+            </w:r>
+            <w:r>
+              <w:rPr>
+                <w:rStyle w:val="VerbatimChar"/>
+              </w:rPr>
+              <w:t xml:space="preserve">text</w:t>
+            </w:r>
+          </w:p>
+        </w:tc>
+        <w:tc>
+          <w:tcPr/>
+          <w:p>
+            <w:pPr>
+              <w:pStyle w:val="Compact"/>
+            </w:pPr>
+            <w:r>
+              <w:t xml:space="preserve">Streams</w:t>
+            </w:r>
+            <w:r>
+              <w:t xml:space="preserve"> </w:t>
+            </w:r>
+            <w:r>
+              <w:rPr>
+                <w:rStyle w:val="VerbatimChar"/>
+              </w:rPr>
+              <w:t xml:space="preserve">list</w:t>
+            </w:r>
+            <w:r>
+              <w:t xml:space="preserve">,</w:t>
+            </w:r>
+            <w:r>
+              <w:t xml:space="preserve"> </w:t>
+            </w:r>
+            <w:r>
+              <w:rPr>
+                <w:rStyle w:val="VerbatimChar"/>
+              </w:rPr>
+              <w:t xml:space="preserve">items</w:t>
+            </w:r>
+            <w:r>
+              <w:t xml:space="preserve">,</w:t>
+            </w:r>
+            <w:r>
+              <w:t xml:space="preserve"> </w:t>
+            </w:r>
+            <w:r>
+              <w:rPr>
+                <w:rStyle w:val="VerbatimChar"/>
+              </w:rPr>
+              <w:t xml:space="preserve">item</w:t>
+            </w:r>
+            <w:r>
+              <w:t xml:space="preserve">,</w:t>
+            </w:r>
+            <w:r>
+              <w:t xml:space="preserve"> </w:t>
+            </w:r>
+            <w:r>
+              <w:rPr>
+                <w:rStyle w:val="VerbatimChar"/>
+              </w:rPr>
+              <w:t xml:space="preserve">final</w:t>
+            </w:r>
+            <w:r>
+              <w:t xml:space="preserve"> </w:t>
+            </w:r>
+            <w:r>
+              <w:t xml:space="preserve">with</w:t>
+            </w:r>
+            <w:r>
+              <w:t xml:space="preserve"> </w:t>
+            </w:r>
+            <w:r>
+              <w:rPr>
+                <w:rStyle w:val="VerbatimChar"/>
+              </w:rPr>
+              <w:t xml:space="preserve">picks</w:t>
+            </w:r>
+            <w:r>
+              <w:t xml:space="preserve"> </w:t>
+            </w:r>
+            <w:r>
+              <w:t xml:space="preserve">and</w:t>
+            </w:r>
+            <w:r>
+              <w:t xml:space="preserve"> </w:t>
+            </w:r>
+            <w:r>
+              <w:rPr>
+                <w:rStyle w:val="VerbatimChar"/>
+              </w:rPr>
+              <w:t xml:space="preserve">total</w:t>
+            </w:r>
+          </w:p>
+        </w:tc>
+      </w:tr>
+      <w:tr>
+        <w:tc>
+          <w:tcPr/>
+          <w:p>
+            <w:pPr>
+              <w:pStyle w:val="Compact"/>
+            </w:pPr>
+            <w:r>
+              <w:t xml:space="preserve">POST</w:t>
+            </w:r>
+          </w:p>
+        </w:tc>
+        <w:tc>
+          <w:tcPr/>
+          <w:p>
+            <w:pPr>
+              <w:pStyle w:val="Compact"/>
+            </w:pPr>
+            <w:r>
+              <w:rPr>
+                <w:rStyle w:val="VerbatimChar"/>
+              </w:rPr>
+              <w:t xml:space="preserve">/api/v1/prices/check</w:t>
+            </w:r>
+          </w:p>
+        </w:tc>
+        <w:tc>
+          <w:tcPr/>
+          <w:p>
+            <w:pPr>
+              <w:pStyle w:val="Compact"/>
+            </w:pPr>
+            <w:r>
+              <w:t xml:space="preserve">JSON</w:t>
+            </w:r>
+            <w:r>
+              <w:t xml:space="preserve"> </w:t>
+            </w:r>
+            <w:r>
+              <w:rPr>
+                <w:rStyle w:val="VerbatimChar"/>
+              </w:rPr>
+              <w:t xml:space="preserve">{items: [{id, name, product_url, marketplace, price}]}</w:t>
+            </w:r>
+          </w:p>
+        </w:tc>
+        <w:tc>
+          <w:tcPr/>
+          <w:p>
+            <w:pPr>
+              <w:pStyle w:val="Compact"/>
+            </w:pPr>
+            <w:r>
+              <w:rPr>
+                <w:rStyle w:val="VerbatimChar"/>
+              </w:rPr>
+              <w:t xml:space="preserve">{results: [{id, price, status}]}</w:t>
+            </w:r>
+            <w:r>
+              <w:t xml:space="preserve">, status down/up/same/unknown</w:t>
+            </w:r>
+          </w:p>
+        </w:tc>
+      </w:tr>
+      <w:tr>
+        <w:tc>
+          <w:tcPr/>
+          <w:p>
+            <w:pPr>
+              <w:pStyle w:val="Compact"/>
+            </w:pPr>
+            <w:r>
+              <w:t xml:space="preserve">POST</w:t>
+            </w:r>
+          </w:p>
+        </w:tc>
+        <w:tc>
+          <w:tcPr/>
+          <w:p>
+            <w:pPr>
+              <w:pStyle w:val="Compact"/>
+            </w:pPr>
+            <w:r>
+              <w:rPr>
+                <w:rStyle w:val="VerbatimChar"/>
+              </w:rPr>
               <w:t xml:space="preserve">/api/v1/tryon</w:t>
             </w:r>
           </w:p>
@@ -5047,8 +5652,8 @@
         <w:t xml:space="preserve">).</w:t>
       </w:r>
     </w:p>
-    <w:bookmarkEnd w:id="34"/>
-    <w:bookmarkStart w:id="35" w:name="running-it-locally"/>
+    <w:bookmarkEnd w:id="37"/>
+    <w:bookmarkStart w:id="38" w:name="running-it-locally"/>
     <w:p>
       <w:pPr>
         <w:pStyle w:val="Heading2"/>
@@ -5556,8 +6161,8 @@
         <w:t xml:space="preserve">; the reloader can stall. After changing backend code, restart the server.</w:t>
       </w:r>
     </w:p>
-    <w:bookmarkEnd w:id="35"/>
-    <w:bookmarkStart w:id="36" w:name="testing-and-quality-checks"/>
+    <w:bookmarkEnd w:id="38"/>
+    <w:bookmarkStart w:id="39" w:name="testing-and-quality-checks"/>
     <w:p>
       <w:pPr>
         <w:pStyle w:val="Heading2"/>
@@ -5656,7 +6261,7 @@
               <w:pStyle w:val="Compact"/>
             </w:pPr>
             <w:r>
-              <w:t xml:space="preserve">264 tests: ranking, prices, Hinglish parsing, outfit, rating, colours, judge, API routes</w:t>
+              <w:t xml:space="preserve">280 tests: ranking, prices, Hinglish parsing, outfit, rating, colours, judge, API routes</w:t>
             </w:r>
           </w:p>
         </w:tc>
@@ -5775,8 +6380,8 @@
         <w:t xml:space="preserve">New features were also checked end to end in Chrome with headless browser scripts (upload a photo, click through, screenshot), against the real services.</w:t>
       </w:r>
     </w:p>
-    <w:bookmarkEnd w:id="36"/>
-    <w:bookmarkStart w:id="37" w:name="deployment-on-vercel"/>
+    <w:bookmarkEnd w:id="39"/>
+    <w:bookmarkStart w:id="40" w:name="deployment-on-vercel"/>
     <w:p>
       <w:pPr>
         <w:pStyle w:val="Heading2"/>
@@ -6197,8 +6802,8 @@
         <w:t xml:space="preserve">. The first search after a quiet period is slower while it loads (a cold start).</w:t>
       </w:r>
     </w:p>
-    <w:bookmarkEnd w:id="37"/>
-    <w:bookmarkStart w:id="38" w:name="troubleshooting-limits-and-glossary"/>
+    <w:bookmarkEnd w:id="40"/>
+    <w:bookmarkStart w:id="41" w:name="troubleshooting-limits-and-glossary"/>
     <w:p>
       <w:pPr>
         <w:pStyle w:val="Heading2"/>
@@ -6926,7 +7531,7 @@
         </w:tc>
       </w:tr>
     </w:tbl>
-    <w:bookmarkEnd w:id="38"/>
+    <w:bookmarkEnd w:id="41"/>
     <w:sectPr>
       <w:footnotePr>
         <w:numRestart w:val="eachSect"/>

</xml_diff>

<commit_message>
Redesign the app around one search box and a tool grid
- Home: one search box (type, voice in English or Hindi, or the camera
  for a photo), then "What would you like to do?": every tool as a card,
  grouped as Find & save, Style me, and Plan & gift.
- Each tool opens its own page with only its inputs and an "All tools"
  link. The photo tools share one page that asks what to do with the
  photo (find this product, the outfit, rate it, shop the room, shop my
  list) with a single action button; a typed list lives there too.
- Removed the hero shortcut chips, mode tabs, button piles, showcase and
  feature sections; the FAQ shows five questions first; searches left
  moved to the footer. The page is about 40% shorter.
- Cards: Compare and Complete look share one quiet row. Header labels
  collapse to icons on phones; the chat button shrinks to an icon so it
  never covers the compare bar.

Co-Authored-By: Claude Opus 5.5 <noreply@anthropic.com>
</commit_message>
<xml_diff>
--- a/docs/SnapBuy AI - Project Guide.docx
+++ b/docs/SnapBuy AI - Project Guide.docx
@@ -607,6 +607,24 @@
       </w:pPr>
       <w:r>
         <w:t xml:space="preserve">No sign-up is needed. Saved items, recent searches, try-on photos and the colour palette stay in the user's browser.</w:t>
+      </w:r>
+    </w:p>
+    <w:p>
+      <w:pPr>
+        <w:pStyle w:val="BodyText"/>
+      </w:pPr>
+      <w:r>
+        <w:rPr>
+          <w:b/>
+          <w:bCs/>
+        </w:rPr>
+        <w:t xml:space="preserve">How the app is laid out.</w:t>
+      </w:r>
+      <w:r>
+        <w:t xml:space="preserve"> </w:t>
+      </w:r>
+      <w:r>
+        <w:t xml:space="preserve">The home page has one search box (type, speak, or tap the camera for a photo) and below it a "What would you like to do?" grid of every tool, grouped as Find &amp; save, Style me, and Plan &amp; gift. Each tool opens its own page with only its inputs and an "All tools" link back. All photo tools share one page that asks "What should we do with the photo?" (find this product, find the outfit, rate my outfit, shop this room, shop my list), with one action button. Results appear under the search box or the tool.</w:t>
       </w:r>
     </w:p>
     <w:bookmarkEnd w:id="13"/>
@@ -1752,7 +1770,7 @@
         <w:rPr>
           <w:rStyle w:val="VerbatimChar"/>
         </w:rPr>
-        <w:t xml:space="preserve">        │   ├── UploadPanel.jsx         Photo upload, crop, Find the outfit, Rate my outfit buttons</w:t>
+        <w:t xml:space="preserve">        │   ├── HomeSearch.jsx          The home search box: type, voice (English/Hindi), camera</w:t>
       </w:r>
       <w:r>
         <w:br/>
@@ -1761,7 +1779,7 @@
         <w:rPr>
           <w:rStyle w:val="VerbatimChar"/>
         </w:rPr>
-        <w:t xml:space="preserve">        │   ├── TextSearchPanel.jsx     Typed and voice search, English/Hindi toggle</w:t>
+        <w:t xml:space="preserve">        │   ├── ToolGrid.jsx            "What would you like to do?" grid of every tool</w:t>
       </w:r>
       <w:r>
         <w:br/>
@@ -1770,6 +1788,15 @@
         <w:rPr>
           <w:rStyle w:val="VerbatimChar"/>
         </w:rPr>
+        <w:t xml:space="preserve">        │   ├── UploadPanel.jsx         Photo page: upload, crop, what to do with the photo, one action</w:t>
+      </w:r>
+      <w:r>
+        <w:br/>
+      </w:r>
+      <w:r>
+        <w:rPr>
+          <w:rStyle w:val="VerbatimChar"/>
+        </w:rPr>
         <w:t xml:space="preserve">        │   ├── ResultsView.jsx         Results page: sections, filters, deals, dupes</w:t>
       </w:r>
       <w:r>
@@ -1806,7 +1833,7 @@
         <w:rPr>
           <w:rStyle w:val="VerbatimChar"/>
         </w:rPr>
-        <w:t xml:space="preserve">        │   ├── PlanPanel.jsx           Budget look planner form (the "Plan" tab)</w:t>
+        <w:t xml:space="preserve">        │   ├── PlanPanel.jsx           Budget look planner form</w:t>
       </w:r>
       <w:r>
         <w:br/>
@@ -1815,7 +1842,7 @@
         <w:rPr>
           <w:rStyle w:val="VerbatimChar"/>
         </w:rPr>
-        <w:t xml:space="preserve">        │   ├── GiftPanel.jsx           Gift finder form (the "Gift" tab)</w:t>
+        <w:t xml:space="preserve">        │   ├── GiftPanel.jsx           Gift finder form</w:t>
       </w:r>
       <w:r>
         <w:br/>
@@ -1878,7 +1905,7 @@
         <w:rPr>
           <w:rStyle w:val="VerbatimChar"/>
         </w:rPr>
-        <w:t xml:space="preserve">        │   ├── Landing.jsx, Showcase.jsx, HeroHeadline.jsx  Home page sections</w:t>
+        <w:t xml:space="preserve">        │   ├── Landing.jsx             Home page: how it works and the FAQ</w:t>
       </w:r>
       <w:r>
         <w:br/>
@@ -1915,6 +1942,15 @@
           <w:rStyle w:val="VerbatimChar"/>
         </w:rPr>
         <w:t xml:space="preserve">        └── lib/</w:t>
+      </w:r>
+      <w:r>
+        <w:br/>
+      </w:r>
+      <w:r>
+        <w:rPr>
+          <w:rStyle w:val="VerbatimChar"/>
+        </w:rPr>
+        <w:t xml:space="preserve">            ├── tools.js                The list of tools shown on the home page</w:t>
       </w:r>
       <w:r>
         <w:br/>
@@ -2585,7 +2621,7 @@
         <w:pStyle w:val="FirstParagraph"/>
       </w:pPr>
       <w:r>
-        <w:t xml:space="preserve">The "Plan" tab takes an occasion, who it's for and a total budget (or a budget in the sentence, such as "2k tak").</w:t>
+        <w:t xml:space="preserve">The "Plan a look on a budget" page takes an occasion, who it's for and a total budget (or a budget in the sentence, such as "2k tak").</w:t>
       </w:r>
     </w:p>
     <w:p>
@@ -2675,7 +2711,7 @@
         <w:pStyle w:val="FirstParagraph"/>
       </w:pPr>
       <w:r>
-        <w:t xml:space="preserve">The "Gift" tab: chips for who it's for and the occasion, what they like and a budget (Hindi and Hinglish work). A Groq model suggests six varied ideas with a reason each; each is searched, checked by the listing judge, and listings well over the budget are dropped. Code:</w:t>
+        <w:t xml:space="preserve">The "Find a gift" page: chips for who it's for and the occasion, what they like and a budget (Hindi and Hinglish work). A Groq model suggests six varied ideas with a reason each; each is searched, checked by the listing judge, and listings well over the budget are dropped. Code:</w:t>
       </w:r>
       <w:r>
         <w:t xml:space="preserve"> </w:t>
@@ -2717,7 +2753,7 @@
         <w:pStyle w:val="FirstParagraph"/>
       </w:pPr>
       <w:r>
-        <w:t xml:space="preserve">A photo of a handwritten list or chat screenshot ("Shop my list" under Photo), or a typed list ("Have a whole list?" under Text). AI reads each line into an English search with quantity and any written budget; each is searched and checked; the best listing at about the typical price is picked per line and the cart total counts quantities. Code:</w:t>
+        <w:t xml:space="preserve">A photo of a handwritten list or chat screenshot (the "Shop my list" tool, or "Shop my list" as the photo's purpose), or a typed list ("Type your list instead" on the same page). AI reads each line into an English search with quantity and any written budget; each is searched and checked; the best listing at about the typical price is picked per line and the cart total counts quantities. Code:</w:t>
       </w:r>
       <w:r>
         <w:t xml:space="preserve"> </w:t>

</xml_diff>